<commit_message>
Micro Exam 2: two Webster Review quizzes (40 + 40) from her in-class review
80 new questions, one per review item per set plus extras on her Know-cold items
(Lectures 7, 10, 12; light-touch and excluded organisms left out). Blind review 80/80
with 0 wrong-key suspects; audit flagged 11, repaired and re-audited to pass. Ten facts
the study guide lacked were written into it from the vetted explanations; guide links
513/513 passage, strict check OK. Linked from the homepage and the Webster review page.

Co-Authored-By: Claude Opus 5.5 <noreply@anthropic.com>
</commit_message>
<xml_diff>
--- a/Microbiology Exam 2/micro-exam-2-webster-review.docx
+++ b/Microbiology Exam 2/micro-exam-2-webster-review.docx
@@ -29446,7 +29446,35 @@
                 <w:b w:val="0"/>
                 <w:i w:val="0"/>
               </w:rPr>
-              <w:t xml:space="preserve"> condenses them.</w:t>
+              <w:t xml:space="preserve"> condenses them. To test yourself on exactly this review, the two </w:t>
+            </w:r>
+            <w:r>
+              <w:rPr>
+                <w:b w:val="0"/>
+                <w:i w:val="0"/>
+              </w:rPr>
+              <w:t>Webster Review quizzes</w:t>
+            </w:r>
+            <w:r>
+              <w:rPr>
+                <w:b w:val="0"/>
+                <w:i w:val="0"/>
+              </w:rPr>
+              <w:t xml:space="preserve"> (</w:t>
+            </w:r>
+            <w:r>
+              <w:rPr>
+                <w:b w:val="0"/>
+                <w:i w:val="0"/>
+              </w:rPr>
+              <w:t>Set 2</w:t>
+            </w:r>
+            <w:r>
+              <w:rPr>
+                <w:b w:val="0"/>
+                <w:i w:val="0"/>
+              </w:rPr>
+              <w:t>) give every item above a question in each set, with extra ones on the Know cold items.</w:t>
             </w:r>
           </w:p>
         </w:tc>

</xml_diff>